<commit_message>
GLOB-849: Adjustment in the cancellation endorsement calculation due to the earned days calculation; both premium and tax calculations were adjusted.
</commit_message>
<xml_diff>
--- a/Reportes/FormatoEndosos.docx
+++ b/Reportes/FormatoEndosos.docx
@@ -140,6 +140,7 @@
               <w:t xml:space="preserve">Póliza </w:t>
             </w:r>
             <w:proofErr w:type="spellStart"/>
+            <w:proofErr w:type="gramStart"/>
             <w:r>
               <w:rPr>
                 <w:sz w:val="14"/>
@@ -156,6 +157,7 @@
               <w:t>:{</w:t>
             </w:r>
             <w:proofErr w:type="spellStart"/>
+            <w:proofErr w:type="gramEnd"/>
             <w:r>
               <w:rPr>
                 <w:sz w:val="14"/>
@@ -271,15 +273,33 @@
                 <w:sz w:val="14"/>
                 <w:szCs w:val="14"/>
               </w:rPr>
-              <w:t xml:space="preserve">Endoso No. </w:t>
-            </w:r>
+              <w:t>Endoso No</w:t>
+            </w:r>
+            <w:proofErr w:type="gramStart"/>
             <w:r>
               <w:rPr>
                 <w:spacing w:val="-2"/>
                 <w:sz w:val="14"/>
                 <w:szCs w:val="14"/>
               </w:rPr>
-              <w:t>: {</w:t>
+              <w:t xml:space="preserve">. </w:t>
+            </w:r>
+            <w:r>
+              <w:rPr>
+                <w:spacing w:val="-2"/>
+                <w:sz w:val="14"/>
+                <w:szCs w:val="14"/>
+              </w:rPr>
+              <w:t>:</w:t>
+            </w:r>
+            <w:proofErr w:type="gramEnd"/>
+            <w:r>
+              <w:rPr>
+                <w:spacing w:val="-2"/>
+                <w:sz w:val="14"/>
+                <w:szCs w:val="14"/>
+              </w:rPr>
+              <w:t xml:space="preserve"> {</w:t>
             </w:r>
             <w:proofErr w:type="spellStart"/>
             <w:r>
@@ -537,7 +557,7 @@
       </w:tblGrid>
       <w:tr>
         <w:trPr>
-          <w:trHeight w:hRule="exact" w:val="284"/>
+          <w:trHeight w:hRule="exact" w:val="227"/>
         </w:trPr>
         <w:tc>
           <w:tcPr>
@@ -668,7 +688,7 @@
       </w:tblGrid>
       <w:tr>
         <w:trPr>
-          <w:trHeight w:val="284"/>
+          <w:trHeight w:val="227"/>
         </w:trPr>
         <w:tc>
           <w:tcPr>
@@ -875,7 +895,7 @@
       </w:tr>
       <w:tr>
         <w:trPr>
-          <w:trHeight w:val="284"/>
+          <w:trHeight w:val="227"/>
         </w:trPr>
         <w:tc>
           <w:tcPr>
@@ -1065,7 +1085,7 @@
       </w:tr>
       <w:tr>
         <w:trPr>
-          <w:trHeight w:val="284"/>
+          <w:trHeight w:val="227"/>
         </w:trPr>
         <w:tc>
           <w:tcPr>
@@ -1288,7 +1308,7 @@
       </w:tr>
       <w:tr>
         <w:trPr>
-          <w:trHeight w:val="284"/>
+          <w:trHeight w:val="227"/>
         </w:trPr>
         <w:tc>
           <w:tcPr>
@@ -1512,7 +1532,7 @@
       </w:tr>
       <w:tr>
         <w:trPr>
-          <w:trHeight w:val="284"/>
+          <w:trHeight w:val="227"/>
         </w:trPr>
         <w:tc>
           <w:tcPr>
@@ -1718,7 +1738,7 @@
       </w:tr>
       <w:tr>
         <w:trPr>
-          <w:trHeight w:val="284"/>
+          <w:trHeight w:val="227"/>
         </w:trPr>
         <w:tc>
           <w:tcPr>
@@ -1909,7 +1929,7 @@
       </w:tblGrid>
       <w:tr>
         <w:trPr>
-          <w:trHeight w:hRule="exact" w:val="284"/>
+          <w:trHeight w:hRule="exact" w:val="227"/>
         </w:trPr>
         <w:tc>
           <w:tcPr>
@@ -1981,7 +2001,7 @@
       </w:tr>
       <w:tr>
         <w:trPr>
-          <w:trHeight w:hRule="exact" w:val="284"/>
+          <w:trHeight w:hRule="exact" w:val="227"/>
         </w:trPr>
         <w:tc>
           <w:tcPr>
@@ -2198,7 +2218,7 @@
       </w:tblGrid>
       <w:tr>
         <w:trPr>
-          <w:trHeight w:hRule="exact" w:val="284"/>
+          <w:trHeight w:hRule="exact" w:val="227"/>
         </w:trPr>
         <w:tc>
           <w:tcPr>
@@ -2262,7 +2282,7 @@
       </w:tr>
       <w:tr>
         <w:trPr>
-          <w:trHeight w:hRule="exact" w:val="284"/>
+          <w:trHeight w:hRule="exact" w:val="227"/>
         </w:trPr>
         <w:tc>
           <w:tcPr>
@@ -2511,7 +2531,7 @@
       </w:tr>
       <w:tr>
         <w:trPr>
-          <w:trHeight w:hRule="exact" w:val="284"/>
+          <w:trHeight w:hRule="exact" w:val="227"/>
         </w:trPr>
         <w:tc>
           <w:tcPr>
@@ -2758,7 +2778,7 @@
       </w:tr>
       <w:tr>
         <w:trPr>
-          <w:trHeight w:hRule="exact" w:val="284"/>
+          <w:trHeight w:hRule="exact" w:val="227"/>
         </w:trPr>
         <w:tc>
           <w:tcPr>
@@ -2982,7 +3002,7 @@
       </w:tr>
       <w:tr>
         <w:trPr>
-          <w:trHeight w:hRule="exact" w:val="284"/>
+          <w:trHeight w:hRule="exact" w:val="227"/>
         </w:trPr>
         <w:tc>
           <w:tcPr>
@@ -3115,7 +3135,7 @@
       </w:tr>
       <w:tr>
         <w:trPr>
-          <w:trHeight w:hRule="exact" w:val="284"/>
+          <w:trHeight w:hRule="exact" w:val="227"/>
         </w:trPr>
         <w:tc>
           <w:tcPr>
@@ -3235,7 +3255,7 @@
       </w:tblGrid>
       <w:tr>
         <w:trPr>
-          <w:trHeight w:val="284"/>
+          <w:trHeight w:val="227"/>
         </w:trPr>
         <w:tc>
           <w:tcPr>
@@ -3375,7 +3395,7 @@
       </w:tr>
       <w:tr>
         <w:trPr>
-          <w:trHeight w:val="284"/>
+          <w:trHeight w:val="227"/>
         </w:trPr>
         <w:tc>
           <w:tcPr>
@@ -3476,7 +3496,7 @@
       </w:tr>
       <w:tr>
         <w:trPr>
-          <w:trHeight w:val="284"/>
+          <w:trHeight w:val="227"/>
         </w:trPr>
         <w:tc>
           <w:tcPr>
@@ -3606,7 +3626,7 @@
       </w:tblGrid>
       <w:tr>
         <w:trPr>
-          <w:trHeight w:val="284"/>
+          <w:trHeight w:val="227"/>
         </w:trPr>
         <w:tc>
           <w:tcPr>
@@ -3723,7 +3743,7 @@
       </w:tr>
       <w:tr>
         <w:trPr>
-          <w:trHeight w:val="284"/>
+          <w:trHeight w:val="227"/>
         </w:trPr>
         <w:tc>
           <w:tcPr>
@@ -3751,6 +3771,7 @@
               </w:rPr>
               <w:t>#</w:t>
             </w:r>
+            <w:proofErr w:type="gramStart"/>
             <w:r>
               <w:rPr>
                 <w:sz w:val="16"/>
@@ -3763,7 +3784,15 @@
                 <w:sz w:val="16"/>
                 <w:szCs w:val="16"/>
               </w:rPr>
-              <w:t>}{#</w:t>
+              <w:t>}{</w:t>
+            </w:r>
+            <w:proofErr w:type="gramEnd"/>
+            <w:r>
+              <w:rPr>
+                <w:sz w:val="16"/>
+                <w:szCs w:val="16"/>
+              </w:rPr>
+              <w:t>#</w:t>
             </w:r>
             <w:r>
               <w:rPr>
@@ -3906,6 +3935,7 @@
               <w:t>premiumDif</w:t>
             </w:r>
             <w:proofErr w:type="spellEnd"/>
+            <w:proofErr w:type="gramStart"/>
             <w:r>
               <w:rPr>
                 <w:sz w:val="16"/>
@@ -3918,7 +3948,15 @@
                 <w:sz w:val="16"/>
                 <w:szCs w:val="16"/>
               </w:rPr>
-              <w:t>{/}</w:t>
+              <w:t>{</w:t>
+            </w:r>
+            <w:proofErr w:type="gramEnd"/>
+            <w:r>
+              <w:rPr>
+                <w:sz w:val="16"/>
+                <w:szCs w:val="16"/>
+              </w:rPr>
+              <w:t>/}</w:t>
             </w:r>
             <w:r>
               <w:rPr>
@@ -3961,7 +3999,7 @@
       </w:tblGrid>
       <w:tr>
         <w:trPr>
-          <w:trHeight w:hRule="exact" w:val="284"/>
+          <w:trHeight w:hRule="exact" w:val="227"/>
           <w:jc w:val="right"/>
         </w:trPr>
         <w:tc>
@@ -4071,7 +4109,7 @@
       </w:tr>
       <w:tr>
         <w:trPr>
-          <w:trHeight w:hRule="exact" w:val="284"/>
+          <w:trHeight w:hRule="exact" w:val="227"/>
           <w:jc w:val="right"/>
         </w:trPr>
         <w:tc>
@@ -4155,7 +4193,7 @@
       </w:tr>
       <w:tr>
         <w:trPr>
-          <w:trHeight w:hRule="exact" w:val="284"/>
+          <w:trHeight w:hRule="exact" w:val="227"/>
           <w:jc w:val="right"/>
         </w:trPr>
         <w:tc>
@@ -4301,6 +4339,7 @@
                 <w:sz w:val="20"/>
               </w:rPr>
             </w:pPr>
+            <w:proofErr w:type="gramStart"/>
             <w:r>
               <w:rPr>
                 <w:sz w:val="16"/>
@@ -4321,6 +4360,7 @@
               </w:rPr>
               <w:t>entendido</w:t>
             </w:r>
+            <w:proofErr w:type="gramEnd"/>
             <w:r>
               <w:rPr>
                 <w:rFonts w:ascii="Times New Roman" w:hAnsi="Times New Roman"/>
@@ -5607,6 +5647,7 @@
               </w:rPr>
               <w:t xml:space="preserve"> </w:t>
             </w:r>
+            <w:proofErr w:type="gramStart"/>
             <w:r>
               <w:rPr>
                 <w:w w:val="105"/>
@@ -5630,7 +5671,16 @@
                 <w:sz w:val="14"/>
                 <w:szCs w:val="14"/>
               </w:rPr>
-              <w:t>507)</w:t>
+              <w:t>507</w:t>
+            </w:r>
+            <w:proofErr w:type="gramEnd"/>
+            <w:r>
+              <w:rPr>
+                <w:w w:val="105"/>
+                <w:sz w:val="14"/>
+                <w:szCs w:val="14"/>
+              </w:rPr>
+              <w:t>)</w:t>
             </w:r>
             <w:r>
               <w:rPr>
@@ -5686,6 +5736,7 @@
               </w:rPr>
               <w:t xml:space="preserve"> </w:t>
             </w:r>
+            <w:proofErr w:type="gramStart"/>
             <w:r>
               <w:rPr>
                 <w:w w:val="105"/>
@@ -5709,7 +5760,16 @@
                 <w:sz w:val="14"/>
                 <w:szCs w:val="14"/>
               </w:rPr>
-              <w:t>507)</w:t>
+              <w:t>507</w:t>
+            </w:r>
+            <w:proofErr w:type="gramEnd"/>
+            <w:r>
+              <w:rPr>
+                <w:w w:val="105"/>
+                <w:sz w:val="14"/>
+                <w:szCs w:val="14"/>
+              </w:rPr>
+              <w:t>)</w:t>
             </w:r>
             <w:r>
               <w:rPr>

</xml_diff>

<commit_message>
Ajustes reportes de endoso y tarificación de emisión con primas manuales y endoso respetando primas manuales
</commit_message>
<xml_diff>
--- a/Reportes/FormatoEndosos.docx
+++ b/Reportes/FormatoEndosos.docx
@@ -1460,7 +1460,7 @@
             <w:tcBorders>
               <w:top w:val="nil"/>
               <w:left w:val="single" w:sz="8" w:space="0" w:color="auto"/>
-              <w:bottom w:val="nil"/>
+              <w:bottom w:val="single" w:sz="8" w:space="0" w:color="auto"/>
             </w:tcBorders>
             <w:vAlign w:val="center"/>
           </w:tcPr>
@@ -1484,6 +1484,9 @@
         <w:tc>
           <w:tcPr>
             <w:tcW w:w="2485" w:type="dxa"/>
+            <w:tcBorders>
+              <w:bottom w:val="single" w:sz="8" w:space="0" w:color="auto"/>
+            </w:tcBorders>
             <w:vAlign w:val="center"/>
           </w:tcPr>
           <w:p>
@@ -1690,9 +1693,9 @@
             <w:tcW w:w="3257" w:type="dxa"/>
             <w:gridSpan w:val="2"/>
             <w:tcBorders>
-              <w:top w:val="nil"/>
+              <w:top w:val="single" w:sz="8" w:space="0" w:color="auto"/>
               <w:left w:val="single" w:sz="8" w:space="0" w:color="auto"/>
-              <w:bottom w:val="nil"/>
+              <w:bottom w:val="single" w:sz="8" w:space="0" w:color="auto"/>
             </w:tcBorders>
           </w:tcPr>
           <w:p>
@@ -1706,32 +1709,10 @@
             </w:pPr>
             <w:r>
               <w:rPr>
-                <w:b/>
-                <w:bCs/>
-                <w:sz w:val="16"/>
-                <w:szCs w:val="16"/>
-              </w:rPr>
-              <w:t>{</w:t>
-            </w:r>
-            <w:proofErr w:type="spellStart"/>
-            <w:r>
-              <w:rPr>
-                <w:b/>
-                <w:bCs/>
-                <w:sz w:val="16"/>
-                <w:szCs w:val="16"/>
-              </w:rPr>
-              <w:t>TituloEndosoCanEfectiva</w:t>
-            </w:r>
-            <w:proofErr w:type="spellEnd"/>
-            <w:r>
-              <w:rPr>
-                <w:b/>
-                <w:bCs/>
-                <w:sz w:val="16"/>
-                <w:szCs w:val="16"/>
-              </w:rPr>
-              <w:t>}</w:t>
+                <w:sz w:val="16"/>
+                <w:szCs w:val="16"/>
+              </w:rPr>
+              <w:t>Fecha Efectiva del Endoso</w:t>
             </w:r>
           </w:p>
         </w:tc>
@@ -1757,15 +1738,7 @@
                 <w:sz w:val="16"/>
                 <w:szCs w:val="16"/>
               </w:rPr>
-              <w:t>Ciudad</w:t>
-            </w:r>
-            <w:r>
-              <w:rPr>
-                <w:b/>
-                <w:sz w:val="16"/>
-                <w:szCs w:val="16"/>
-              </w:rPr>
-              <w:t>:</w:t>
+              <w:t>Ciudad:</w:t>
             </w:r>
           </w:p>
         </w:tc>
@@ -1852,18 +1825,52 @@
         </w:tc>
         <w:tc>
           <w:tcPr>
-            <w:tcW w:w="3257" w:type="dxa"/>
-            <w:gridSpan w:val="2"/>
+            <w:tcW w:w="772" w:type="dxa"/>
             <w:tcBorders>
-              <w:top w:val="nil"/>
+              <w:top w:val="single" w:sz="8" w:space="0" w:color="auto"/>
               <w:left w:val="single" w:sz="8" w:space="0" w:color="auto"/>
               <w:bottom w:val="single" w:sz="8" w:space="0" w:color="auto"/>
+              <w:right w:val="nil"/>
             </w:tcBorders>
           </w:tcPr>
           <w:p>
             <w:pPr>
               <w:pStyle w:val="Textoindependiente"/>
-              <w:jc w:val="center"/>
+              <w:rPr>
+                <w:sz w:val="16"/>
+                <w:szCs w:val="16"/>
+              </w:rPr>
+            </w:pPr>
+            <w:r>
+              <w:rPr>
+                <w:b/>
+                <w:bCs/>
+                <w:sz w:val="16"/>
+                <w:szCs w:val="16"/>
+              </w:rPr>
+              <w:t>Desde</w:t>
+            </w:r>
+            <w:r>
+              <w:rPr>
+                <w:sz w:val="16"/>
+                <w:szCs w:val="16"/>
+              </w:rPr>
+              <w:t>:</w:t>
+            </w:r>
+          </w:p>
+        </w:tc>
+        <w:tc>
+          <w:tcPr>
+            <w:tcW w:w="2485" w:type="dxa"/>
+            <w:tcBorders>
+              <w:top w:val="single" w:sz="8" w:space="0" w:color="auto"/>
+              <w:left w:val="nil"/>
+              <w:bottom w:val="single" w:sz="8" w:space="0" w:color="auto"/>
+            </w:tcBorders>
+          </w:tcPr>
+          <w:p>
+            <w:pPr>
+              <w:pStyle w:val="Textoindependiente"/>
               <w:rPr>
                 <w:sz w:val="16"/>
                 <w:szCs w:val="16"/>
@@ -1879,11 +1886,10 @@
             <w:proofErr w:type="spellStart"/>
             <w:r>
               <w:rPr>
-                <w:b/>
-                <w:sz w:val="16"/>
-                <w:szCs w:val="16"/>
-              </w:rPr>
-              <w:t>TituloCanceFecha</w:t>
+                <w:sz w:val="16"/>
+                <w:szCs w:val="16"/>
+              </w:rPr>
+              <w:t>FechaEfectiva</w:t>
             </w:r>
             <w:proofErr w:type="spellEnd"/>
             <w:r>

</xml_diff>